<commit_message>
Revise Unit 2 study guide (hybrid concept + HR header)
Co-authored-by: Cursor <cursoragent@cursor.com>
</commit_message>
<xml_diff>
--- a/production/review/unit-02/unit2-written-study-review.docx
+++ b/production/review/unit-02/unit2-written-study-review.docx
@@ -65,7 +65,7 @@
           <w:color w:val="1F1F1F"/>
           <w:sz w:val="24"/>
         </w:rPr>
-        <w:t xml:space="preserve">      Date: </w:t>
+        <w:t xml:space="preserve">    HR:  </w:t>
       </w:r>
       <w:r>
         <w:rPr>
@@ -76,7 +76,40 @@
           <w:sz w:val="24"/>
           <w:u w:val="single"/>
         </w:rPr>
-        <w:t>________________</w:t>
+        <w:t xml:space="preserve">  4A  </w:t>
+      </w:r>
+      <w:r>
+        <w:rPr>
+          <w:rFonts w:ascii="Calibri" w:hAnsi="Calibri" w:cs="Calibri"/>
+          <w:b w:val="0"/>
+          <w:i w:val="0"/>
+          <w:color w:val="1F1F1F"/>
+          <w:sz w:val="24"/>
+          <w:u w:val="single"/>
+        </w:rPr>
+        <w:t xml:space="preserve">  4B  </w:t>
+      </w:r>
+      <w:r>
+        <w:rPr>
+          <w:rFonts w:ascii="Calibri" w:hAnsi="Calibri" w:cs="Calibri"/>
+          <w:b w:val="0"/>
+          <w:i w:val="0"/>
+          <w:color w:val="1F1F1F"/>
+          <w:sz w:val="24"/>
+          <w:u w:val="single"/>
+        </w:rPr>
+        <w:t xml:space="preserve">  4C  </w:t>
+      </w:r>
+      <w:r>
+        <w:rPr>
+          <w:rFonts w:ascii="Calibri" w:hAnsi="Calibri" w:cs="Calibri"/>
+          <w:b w:val="0"/>
+          <w:i w:val="0"/>
+          <w:color w:val="1F1F1F"/>
+          <w:sz w:val="24"/>
+          <w:u w:val="single"/>
+        </w:rPr>
+        <w:t xml:space="preserve">  4D  </w:t>
       </w:r>
     </w:p>
     <w:p>
@@ -1893,6 +1926,21 @@
     </w:p>
     <w:p>
       <w:pPr>
+        <w:spacing w:before="0" w:after="6"/>
+      </w:pPr>
+      <w:r>
+        <w:rPr>
+          <w:rFonts w:ascii="Calibri" w:hAnsi="Calibri" w:cs="Calibri"/>
+          <w:b w:val="0"/>
+          <w:i w:val="0"/>
+          <w:color w:val="1F1F1F"/>
+          <w:sz w:val="26"/>
+        </w:rPr>
+        <w:t>Nuclear power uses ______________ as its fuel; its pathway is the SAME as coal.</w:t>
+      </w:r>
+    </w:p>
+    <w:p>
+      <w:pPr>
         <w:spacing w:before="0" w:after="8"/>
       </w:pPr>
       <w:r>
@@ -1903,7 +1951,7 @@
           <w:color w:val="1F1F1F"/>
           <w:sz w:val="26"/>
         </w:rPr>
-        <w:t>Nuclear power uses ______________ as its fuel; its pathway is the SAME as coal.</w:t>
+        <w:t>A hybrid vehicle uses ______________ different sources of fuel.</w:t>
       </w:r>
     </w:p>
     <w:p>

</xml_diff>